<commit_message>
Update design doc: routing via Business Rule and Script Include
</commit_message>
<xml_diff>
--- a/docs/NagaraMitra_Project_Design_Document.docx
+++ b/docs/NagaraMitra_Project_Design_Document.docx
@@ -49,7 +49,15 @@
     </w:p>
     <w:p>
       <w:r>
-        <w:t>NagaraMitra is a ServiceNow-based grievance platform for a city corporation. A citizen reports a problem once, in their own language, from any channel. The platform routes it to the right ward and department, groups duplicate reports into a single issue, enforces citizen-charter timelines with automatic escalation, and closes a complaint only when the citizen confirms the fix. In the version I am building, rule-based logic classifies complaints and matches duplicates, and approved Telugu, Hindi and English templates carry status updates to citizens, while officers stay in control of every decision. Now Assist features (Smart Categorization, duplicate grouping, multilingual messages and a weekly brief for the Commissioner) are planned if available.</w:t>
+        <w:t xml:space="preserve">NagaraMitra is a ServiceNow-based grievance platform for a city corporation. A citizen reports a problem once, in their own language, from any channel. The platform routes it to the right ward and department, groups duplicate reports into a single issue, </w:t>
+      </w:r>
+      <w:proofErr w:type="gramStart"/>
+      <w:r>
+        <w:t>enforces</w:t>
+      </w:r>
+      <w:proofErr w:type="gramEnd"/>
+      <w:r>
+        <w:t xml:space="preserve"> citizen-charter timelines with automatic escalation, and closes a complaint only when the citizen confirms the fix. In the version I am building, rule-based logic classifies complaints and matches duplicates, and approved Telugu, Hindi and English templates carry status updates to citizens, while officers stay in control of every decision. Now Assist features (Smart Categorization, duplicate grouping, multilingual messages and a weekly brief for the Commissioner) are planned if available.</w:t>
       </w:r>
     </w:p>
     <w:p>
@@ -352,7 +360,7 @@
         <w:t xml:space="preserve">Route it by place: </w:t>
       </w:r>
       <w:r>
-        <w:t>The GPS location is matched to a ward and zone in my Ward table, and a Flow Designer workflow assigns the complaint to that ward's officer group in the right department.</w:t>
+        <w:t>The GPS location is matched to a ward and zone in my Ward table, and a Business Rule calling a Script Include assigns the complaint to that ward's officer group in the right department.</w:t>
       </w:r>
     </w:p>
     <w:p>
@@ -394,7 +402,15 @@
         <w:t xml:space="preserve">Close the loop: </w:t>
       </w:r>
       <w:r>
-        <w:t>The officer resolves the case with photo proof and the citizen is asked to confirm. Confirmation closes it; rejection reopens it.</w:t>
+        <w:t xml:space="preserve">The officer resolves the case with photo </w:t>
+      </w:r>
+      <w:proofErr w:type="gramStart"/>
+      <w:r>
+        <w:t>proof</w:t>
+      </w:r>
+      <w:proofErr w:type="gramEnd"/>
+      <w:r>
+        <w:t xml:space="preserve"> and the citizen is asked to confirm. Confirmation closes it; rejection reopens it.</w:t>
       </w:r>
     </w:p>
     <w:p>
@@ -593,7 +609,15 @@
         <w:t xml:space="preserve">Better decisions: </w:t>
       </w:r>
       <w:r>
-        <w:t>The Commissioner sees where problems repeat and which wards are falling behind.</w:t>
+        <w:t xml:space="preserve">The Commissioner sees where problems repeat and which </w:t>
+      </w:r>
+      <w:proofErr w:type="gramStart"/>
+      <w:r>
+        <w:t>wards</w:t>
+      </w:r>
+      <w:proofErr w:type="gramEnd"/>
+      <w:r>
+        <w:t xml:space="preserve"> are falling behind.</w:t>
       </w:r>
     </w:p>
     <w:p>
@@ -782,7 +806,7 @@
               <w:spacing w:after="60"/>
             </w:pPr>
             <w:r>
-              <w:t>Three layers: (1) channels capture the complaint; (2) the NagaraMitra application holds the data, the rule-based logic and Flow Designer workflows, with Now Assist skills as an optional addition; (3) outcomes reach officers, citizens and the Commissioner. See Figure 1 (architecture), Figure 2 (complaint lifecycle) and Figure 3 (data model).</w:t>
+              <w:t>Three layers: (1) channels capture the complaint; (2) the NagaraMitra application holds the data, the rule-based logic (a Business Rule and Script Include handle routing) and Flow Designer workflows for escalations and notifications, with Now Assist skills as an optional addition; (3) outcomes reach officers, citizens and the Commissioner. See Figure 1 (architecture), Figure 2 (complaint lifecycle) and Figure 3 (data model).</w:t>
             </w:r>
           </w:p>
         </w:tc>
@@ -930,7 +954,7 @@
               <w:spacing w:after="60"/>
             </w:pPr>
             <w:r>
-              <w:t>Create the application, tables, roles and ACLs. Load sample wards, departments, officers, categories, civic assets and test complaints. Build the first routing flow.</w:t>
+              <w:t>Create the application, tables, roles and ACLs. Load sample wards, departments, officers, categories, civic assets and test complaints. Build the first routing logic (Business Rule and Script Include).</w:t>
             </w:r>
           </w:p>
         </w:tc>
@@ -974,7 +998,7 @@
               <w:spacing w:after="60"/>
             </w:pPr>
             <w:r>
-              <w:t>Complaint form with photo and GPS, Virtual Agent intake, rule-based categorisation, geo-routing flow.</w:t>
+              <w:t>Complaint form with photo and GPS, Virtual Agent intake, rule-based categorisation, geo-routing logic in the Script Include.</w:t>
             </w:r>
           </w:p>
         </w:tc>
@@ -1105,7 +1129,15 @@
         <w:t xml:space="preserve">Realistic scope: </w:t>
       </w:r>
       <w:r>
-        <w:t>Every feature maps to an element named in the problem statement, and the core build uses standard platform capabilities (tables, flows, portal, dashboards) rather than custom integrations. The working end-to-end flow comes first and the Now Assist features are optional additions, planned if available.</w:t>
+        <w:t>Every feature maps to an element named in the problem statement, and the core build uses standard platform capabilities (tables, flows, portal, dashboards) rather than custom integrations. The working end-</w:t>
+      </w:r>
+      <w:proofErr w:type="gramStart"/>
+      <w:r>
+        <w:t>to</w:t>
+      </w:r>
+      <w:proofErr w:type="gramEnd"/>
+      <w:r>
+        <w:t>-end flow comes first and the Now Assist features are optional additions, planned if available.</w:t>
       </w:r>
     </w:p>
     <w:p>
@@ -1116,6 +1148,7 @@
         <w:rPr>
           <w:b/>
         </w:rPr>
+        <w:lastRenderedPageBreak/>
         <w:t xml:space="preserve">Skills and resources: </w:t>
       </w:r>
       <w:r>
@@ -1133,11 +1166,7 @@
         <w:t xml:space="preserve">Risk - AI availability: </w:t>
       </w:r>
       <w:r>
-        <w:t xml:space="preserve">Now Assist features may differ on a Personal Developer Instance. I will confirm availability on day one of the build. The built version does not depend on them: it uses </w:t>
-      </w:r>
-      <w:r>
-        <w:lastRenderedPageBreak/>
-        <w:t>rule-based categorisation, rule-based duplicate matching (same category, same ward, nearby location, officer approval) and approved Telugu, Hindi and English message templates. Now Assist features are added only if available.</w:t>
+        <w:t>Now Assist features may differ on a Personal Developer Instance. I will confirm availability on day one of the build. The built version does not depend on them: it uses rule-based categorisation, rule-based duplicate matching (same category, same ward, nearby location, officer approval) and approved Telugu, Hindi and English message templates. Now Assist features are added only if available.</w:t>
       </w:r>
     </w:p>
     <w:p>
@@ -1179,7 +1208,15 @@
         <w:t xml:space="preserve">Risk - time: </w:t>
       </w:r>
       <w:r>
-        <w:t>The MVP-first plan, with each week ending in a working increment, keeps this solo build on track.</w:t>
+        <w:t xml:space="preserve">The MVP-first plan, with each </w:t>
+      </w:r>
+      <w:proofErr w:type="gramStart"/>
+      <w:r>
+        <w:t>week ending</w:t>
+      </w:r>
+      <w:proofErr w:type="gramEnd"/>
+      <w:r>
+        <w:t xml:space="preserve"> in a working increment, keeps this solo build on track.</w:t>
       </w:r>
     </w:p>
     <w:p>
@@ -1595,10 +1632,19 @@
         <w:rPr>
           <w:b/>
         </w:rPr>
+        <w:lastRenderedPageBreak/>
         <w:t xml:space="preserve">Scale: </w:t>
       </w:r>
       <w:r>
-        <w:t>Wards, departments, categories and timelines are data, not code, so another city (for example, other city corporations in Andhra Pradesh) can be onboarded by loading its own structure.</w:t>
+        <w:t xml:space="preserve">Wards, departments, categories and timelines are data, not code, so another city (for example, other city corporations in Andhra Pradesh) can be </w:t>
+      </w:r>
+      <w:proofErr w:type="gramStart"/>
+      <w:r>
+        <w:t>onboarded</w:t>
+      </w:r>
+      <w:proofErr w:type="gramEnd"/>
+      <w:r>
+        <w:t xml:space="preserve"> by loading its own structure.</w:t>
       </w:r>
     </w:p>
     <w:p>
@@ -1634,7 +1680,6 @@
         <w:pStyle w:val="Heading1"/>
       </w:pPr>
       <w:r>
-        <w:lastRenderedPageBreak/>
         <w:t>Project Owner</w:t>
       </w:r>
     </w:p>
@@ -1668,7 +1713,15 @@
         <w:t xml:space="preserve">Background: </w:t>
       </w:r>
       <w:r>
-        <w:t>Final-year B.Tech CSE (AI-ML) student</w:t>
+        <w:t xml:space="preserve">Final-year </w:t>
+      </w:r>
+      <w:proofErr w:type="gramStart"/>
+      <w:r>
+        <w:t>B.Tech</w:t>
+      </w:r>
+      <w:proofErr w:type="gramEnd"/>
+      <w:r>
+        <w:t xml:space="preserve"> CSE (AI-ML) student</w:t>
       </w:r>
     </w:p>
     <w:p>
@@ -1817,7 +1870,25 @@
           <w:sz w:val="20"/>
           <w:szCs w:val="20"/>
         </w:rPr>
-        <w:t>Figure 2: Complaint lifecycle from submission to confirmed closure</w:t>
+        <w:t xml:space="preserve">Figure 2: </w:t>
+      </w:r>
+      <w:proofErr w:type="gramStart"/>
+      <w:r>
+        <w:rPr>
+          <w:i/>
+          <w:sz w:val="20"/>
+          <w:szCs w:val="20"/>
+        </w:rPr>
+        <w:t>Complaint</w:t>
+      </w:r>
+      <w:proofErr w:type="gramEnd"/>
+      <w:r>
+        <w:rPr>
+          <w:i/>
+          <w:sz w:val="20"/>
+          <w:szCs w:val="20"/>
+        </w:rPr>
+        <w:t xml:space="preserve"> lifecycle from submission to confirmed closure</w:t>
       </w:r>
     </w:p>
     <w:p>

</xml_diff>